<commit_message>
Add AI specific wording to resume and summary
</commit_message>
<xml_diff>
--- a/dist/Torsten Uhlmann CV Summary.docx
+++ b/dist/Torsten Uhlmann CV Summary.docx
@@ -95,7 +95,7 @@
                 <w:color w:val="1A5276"/>
                 <w:sz w:val="22"/>
               </w:rPr>
-              <w:t>AGYNAMIX® | Senior Full Stack Software Engineer &amp; Consultant</w:t>
+              <w:t>AGYNAMIX® | Senior Full Stack Software Engineer &amp; AI Integration Consultant</w:t>
             </w:r>
           </w:p>
           <w:p>
@@ -143,7 +143,7 @@
     </w:p>
     <w:p>
       <w:r>
-        <w:t>Senior Full Stack Software Engineer with nearly 30 years of experience delivering robust, high-performance software solutions across diverse industries. Operating through AGYNAMIX, I specialize in taking complex, system-critical applications from prototype to production—whether leading development efforts or integrating into distributed teams, bridging intricate backend architectures with modern, responsive frontend frameworks.</w:t>
+        <w:t>Senior Full Stack Software Engineer with nearly 30 years of experience delivering robust, high-performance software solutions across diverse industries. Operating through AGYNAMIX, I specialize in taking complex, system-critical applications from prototype to production—whether leading development efforts or integrating into distributed teams, bridging intricate backend architectures with modern, responsive frontend frameworks. Recent work includes applied AI integration and Agentic Engineering, including AI-assisted PDF invoice analysis in AGYNAMIX Invoicer with structured extraction, vision models, JSON schema outputs, semantic checks, alternative candidates, and user-in-the-loop review.</w:t>
       </w:r>
     </w:p>
     <w:p>
@@ -163,6 +163,17 @@
       </w:r>
       <w:r>
         <w:t xml:space="preserve"> — Complete solutions from requirement gathering through implementation and deployment.</w:t>
+      </w:r>
+    </w:p>
+    <w:p>
+      <w:r>
+        <w:rPr>
+          <w:b/>
+        </w:rPr>
+        <w:t>Applied AI &amp; Workflow Automation</w:t>
+      </w:r>
+      <w:r>
+        <w:t xml:space="preserve"> — Practical AI integration using Agentic Engineering, LLMs, document AI, and structured extraction.</w:t>
       </w:r>
     </w:p>
     <w:p>
@@ -204,6 +215,17 @@
       </w:pPr>
       <w:r>
         <w:t>Technical Stack</w:t>
+      </w:r>
+    </w:p>
+    <w:p>
+      <w:r>
+        <w:rPr>
+          <w:b/>
+        </w:rPr>
+        <w:t>Applied AI</w:t>
+      </w:r>
+      <w:r>
+        <w:t>: Agentic Engineering, LLM integration, document AI, PDF extraction, vision models, JSON schema outputs, Ollama</w:t>
       </w:r>
     </w:p>
     <w:p>
@@ -358,7 +380,7 @@
     </w:p>
     <w:p>
       <w:r>
-        <w:t>Modern desktop invoicing application (Kotlin, Jetpack Compose for Desktop) for the DACH market. Fully GoBD compliant with ZUGFeRD and XRechnung e-invoice support.</w:t>
+        <w:t>Modern desktop invoicing application (Kotlin, Jetpack Compose for Desktop) for the DACH market. Fully GoBD compliant with ZUGFeRD and XRechnung e-invoice support. AI-assisted PDF invoice analysis extracts supplier, invoice number, dates, VAT amounts, totals, and metadata using local and remote OpenAI-compatible providers, including privacy-friendly local Ollama models.</w:t>
       </w:r>
     </w:p>
     <w:p>

</xml_diff>

<commit_message>
Add cover letter, refine documents
</commit_message>
<xml_diff>
--- a/dist/Torsten Uhlmann CV Summary.docx
+++ b/dist/Torsten Uhlmann CV Summary.docx
@@ -4,7 +4,7 @@
   <w:body>
     <w:tbl>
       <w:tblPr>
-        <w:tblW w:type="auto" w:w="0"/>
+        <w:tblW w:type="dxa" w:w="9864"/>
         <w:jc w:val="center"/>
         <w:tblLook w:firstColumn="1" w:firstRow="1" w:lastColumn="0" w:lastRow="0" w:noHBand="0" w:noVBand="1" w:val="04A0"/>
         <w:tblBorders>
@@ -17,8 +17,8 @@
         </w:tblBorders>
       </w:tblPr>
       <w:tblGrid>
-        <w:gridCol w:w="5100"/>
-        <w:gridCol w:w="5100"/>
+        <w:gridCol w:w="1600"/>
+        <w:gridCol w:w="8264"/>
       </w:tblGrid>
       <w:tr>
         <w:tc>

</xml_diff>